<commit_message>
nmv 25 09 2026
</commit_message>
<xml_diff>
--- a/TS-Kramam/TS-4.2/TS 4.2 Malayalam Krama Paatam Corrections.docx
+++ b/TS-Kramam/TS-4.2/TS 4.2 Malayalam Krama Paatam Corrections.docx
@@ -1,6 +1,6 @@
 
 <file path=word/document.xml><?xml version="1.0" encoding="utf-8"?>
-<w:document xmlns:wpc="http://schemas.microsoft.com/office/word/2010/wordprocessingCanvas" xmlns:cx="http://schemas.microsoft.com/office/drawing/2014/chartex" xmlns:cx1="http://schemas.microsoft.com/office/drawing/2015/9/8/chartex" xmlns:cx2="http://schemas.microsoft.com/office/drawing/2015/10/21/chartex" xmlns:cx3="http://schemas.microsoft.com/office/drawing/2016/5/9/chartex" xmlns:cx4="http://schemas.microsoft.com/office/drawing/2016/5/10/chartex" xmlns:cx5="http://schemas.microsoft.com/office/drawing/2016/5/11/chartex" xmlns:cx6="http://schemas.microsoft.com/office/drawing/2016/5/12/chartex" xmlns:cx7="http://schemas.microsoft.com/office/drawing/2016/5/13/chartex" xmlns:cx8="http://schemas.microsoft.com/office/drawing/2016/5/14/chartex" xmlns:mc="http://schemas.openxmlformats.org/markup-compatibility/2006" xmlns:aink="http://schemas.microsoft.com/office/drawing/2016/ink" xmlns:am3d="http://schemas.microsoft.com/office/drawing/2017/model3d" xmlns:o="urn:schemas-microsoft-com:office:office" xmlns:oel="http://schemas.microsoft.com/office/2019/extlst" xmlns:r="http://schemas.openxmlformats.org/officeDocument/2006/relationships" xmlns:m="http://schemas.openxmlformats.org/officeDocument/2006/math" xmlns:v="urn:schemas-microsoft-com:vml" xmlns:wp14="http://schemas.microsoft.com/office/word/2010/wordprocessingDrawing" xmlns:wp="http://schemas.openxmlformats.org/drawingml/2006/wordprocessingDrawing" xmlns:w10="urn:schemas-microsoft-com:office:word" xmlns:w="http://schemas.openxmlformats.org/wordprocessingml/2006/main" xmlns:w14="http://schemas.microsoft.com/office/word/2010/wordml" xmlns:w15="http://schemas.microsoft.com/office/word/2012/wordml" xmlns:w16cei="http://schemas.microsoft.com/office/word/2026/wordml/cei" xmlns:w16cex="http://schemas.microsoft.com/office/word/2018/wordml/cex" xmlns:w16cid="http://schemas.microsoft.com/office/word/2016/wordml/cid" xmlns:w16="http://schemas.microsoft.com/office/word/2018/wordml" xmlns:w16du="http://schemas.microsoft.com/office/word/2023/wordml/word16du" xmlns:w16sdtdh="http://schemas.microsoft.com/office/word/2020/wordml/sdtdatahash" xmlns:w16sdtfl="http://schemas.microsoft.com/office/word/2024/wordml/sdtformatlock" xmlns:w16se="http://schemas.microsoft.com/office/word/2015/wordml/symex" xmlns:wpg="http://schemas.microsoft.com/office/word/2010/wordprocessingGroup" xmlns:wpi="http://schemas.microsoft.com/office/word/2010/wordprocessingInk" xmlns:wne="http://schemas.microsoft.com/office/word/2006/wordml" xmlns:wps="http://schemas.microsoft.com/office/word/2010/wordprocessingShape" mc:Ignorable="w14 w15 w16se w16cid w16 w16cex w16sdtdh w16sdtfl w16du wp14">
+<w:document xmlns:wpc="http://schemas.microsoft.com/office/word/2010/wordprocessingCanvas" xmlns:cx="http://schemas.microsoft.com/office/drawing/2014/chartex" xmlns:cx1="http://schemas.microsoft.com/office/drawing/2015/9/8/chartex" xmlns:cx2="http://schemas.microsoft.com/office/drawing/2015/10/21/chartex" xmlns:cx3="http://schemas.microsoft.com/office/drawing/2016/5/9/chartex" xmlns:cx4="http://schemas.microsoft.com/office/drawing/2016/5/10/chartex" xmlns:cx5="http://schemas.microsoft.com/office/drawing/2016/5/11/chartex" xmlns:cx6="http://schemas.microsoft.com/office/drawing/2016/5/12/chartex" xmlns:cx7="http://schemas.microsoft.com/office/drawing/2016/5/13/chartex" xmlns:cx8="http://schemas.microsoft.com/office/drawing/2016/5/14/chartex" xmlns:mc="http://schemas.openxmlformats.org/markup-compatibility/2006" xmlns:aink="http://schemas.microsoft.com/office/drawing/2016/ink" xmlns:am3d="http://schemas.microsoft.com/office/drawing/2017/model3d" xmlns:o="urn:schemas-microsoft-com:office:office" xmlns:oel="http://schemas.microsoft.com/office/2019/extlst" xmlns:r="http://schemas.openxmlformats.org/officeDocument/2006/relationships" xmlns:m="http://schemas.openxmlformats.org/officeDocument/2006/math" xmlns:v="urn:schemas-microsoft-com:vml" xmlns:wp14="http://schemas.microsoft.com/office/word/2010/wordprocessingDrawing" xmlns:wp="http://schemas.openxmlformats.org/drawingml/2006/wordprocessingDrawing" xmlns:w10="urn:schemas-microsoft-com:office:word" xmlns:w="http://schemas.openxmlformats.org/wordprocessingml/2006/main" xmlns:w14="http://schemas.microsoft.com/office/word/2010/wordml" xmlns:w15="http://schemas.microsoft.com/office/word/2012/wordml" xmlns:w16cex="http://schemas.microsoft.com/office/word/2018/wordml/cex" xmlns:w16cid="http://schemas.microsoft.com/office/word/2016/wordml/cid" xmlns:w16="http://schemas.microsoft.com/office/word/2018/wordml" xmlns:w16du="http://schemas.microsoft.com/office/word/2023/wordml/word16du" xmlns:w16sdtdh="http://schemas.microsoft.com/office/word/2020/wordml/sdtdatahash" xmlns:w16sdtfl="http://schemas.microsoft.com/office/word/2024/wordml/sdtformatlock" xmlns:w16se="http://schemas.microsoft.com/office/word/2015/wordml/symex" xmlns:wpg="http://schemas.microsoft.com/office/word/2010/wordprocessingGroup" xmlns:wpi="http://schemas.microsoft.com/office/word/2010/wordprocessingInk" xmlns:wne="http://schemas.microsoft.com/office/word/2006/wordml" xmlns:wps="http://schemas.microsoft.com/office/word/2010/wordprocessingShape" mc:Ignorable="w14 w15 w16se w16cid w16 w16cex w16sdtdh w16sdtfl w16du wp14">
   <w:body>
     <w:p>
       <w:pPr>
@@ -81,18 +81,7 @@
           <w:szCs w:val="32"/>
           <w:u w:val="single"/>
         </w:rPr>
-        <w:t xml:space="preserve">Observed </w:t>
-      </w:r>
-      <w:proofErr w:type="gramStart"/>
-      <w:r>
-        <w:rPr>
-          <w:b/>
-          <w:bCs/>
-          <w:sz w:val="32"/>
-          <w:szCs w:val="32"/>
-          <w:u w:val="single"/>
-        </w:rPr>
-        <w:t xml:space="preserve">till </w:t>
+        <w:t xml:space="preserve">Observed till </w:t>
       </w:r>
       <w:r>
         <w:rPr>
@@ -105,7 +94,6 @@
         </w:rPr>
         <w:t>?????</w:t>
       </w:r>
-      <w:proofErr w:type="gramEnd"/>
     </w:p>
     <w:p>
       <w:pPr>
@@ -544,6 +532,320 @@
               <w:rPr>
                 <w:rFonts w:cs="Arial"/>
                 <w:b/>
+                <w:color w:val="EE0000"/>
+                <w:sz w:val="28"/>
+                <w:szCs w:val="32"/>
+              </w:rPr>
+            </w:pPr>
+            <w:r>
+              <w:rPr>
+                <w:rFonts w:cs="Arial"/>
+                <w:b/>
+                <w:color w:val="EE0000"/>
+                <w:sz w:val="28"/>
+                <w:szCs w:val="32"/>
+              </w:rPr>
+              <w:t>T.S.4.2.</w:t>
+            </w:r>
+            <w:r>
+              <w:rPr>
+                <w:rFonts w:cs="Arial"/>
+                <w:b/>
+                <w:color w:val="EE0000"/>
+                <w:sz w:val="28"/>
+                <w:szCs w:val="32"/>
+              </w:rPr>
+              <w:t>6.5</w:t>
+            </w:r>
+            <w:r>
+              <w:rPr>
+                <w:rFonts w:cs="Arial"/>
+                <w:b/>
+                <w:color w:val="EE0000"/>
+                <w:sz w:val="28"/>
+                <w:szCs w:val="32"/>
+              </w:rPr>
+              <w:t xml:space="preserve"> – Kramam</w:t>
+            </w:r>
+          </w:p>
+          <w:p>
+            <w:pPr>
+              <w:widowControl w:val="0"/>
+              <w:tabs>
+                <w:tab w:val="left" w:pos="993"/>
+              </w:tabs>
+              <w:autoSpaceDE w:val="0"/>
+              <w:autoSpaceDN w:val="0"/>
+              <w:adjustRightInd w:val="0"/>
+              <w:spacing w:before="0" w:line="240" w:lineRule="auto"/>
+              <w:ind w:right="297"/>
+              <w:rPr>
+                <w:rFonts w:cs="Arial"/>
+                <w:b/>
+                <w:color w:val="EE0000"/>
+                <w:sz w:val="28"/>
+                <w:szCs w:val="32"/>
+              </w:rPr>
+            </w:pPr>
+            <w:r>
+              <w:rPr>
+                <w:rFonts w:cs="Arial"/>
+                <w:b/>
+                <w:color w:val="EE0000"/>
+                <w:sz w:val="28"/>
+                <w:szCs w:val="32"/>
+              </w:rPr>
+              <w:t xml:space="preserve">Krama Vaakyam No. - </w:t>
+            </w:r>
+            <w:r>
+              <w:rPr>
+                <w:rFonts w:cs="Arial"/>
+                <w:b/>
+                <w:color w:val="EE0000"/>
+                <w:sz w:val="28"/>
+                <w:szCs w:val="32"/>
+              </w:rPr>
+              <w:t>62</w:t>
+            </w:r>
+          </w:p>
+          <w:p>
+            <w:pPr>
+              <w:widowControl w:val="0"/>
+              <w:tabs>
+                <w:tab w:val="left" w:pos="993"/>
+              </w:tabs>
+              <w:autoSpaceDE w:val="0"/>
+              <w:autoSpaceDN w:val="0"/>
+              <w:adjustRightInd w:val="0"/>
+              <w:spacing w:before="0" w:line="240" w:lineRule="auto"/>
+              <w:ind w:right="297"/>
+              <w:rPr>
+                <w:rFonts w:cs="Arial"/>
+                <w:b/>
+                <w:color w:val="EE0000"/>
+                <w:sz w:val="28"/>
+                <w:szCs w:val="32"/>
+              </w:rPr>
+            </w:pPr>
+            <w:r>
+              <w:rPr>
+                <w:rFonts w:cs="Arial"/>
+                <w:b/>
+                <w:color w:val="EE0000"/>
+                <w:sz w:val="28"/>
+                <w:szCs w:val="32"/>
+              </w:rPr>
+              <w:t>Panchaati No</w:t>
+            </w:r>
+            <w:r>
+              <w:rPr>
+                <w:rFonts w:cs="Arial"/>
+                <w:b/>
+                <w:color w:val="EE0000"/>
+                <w:szCs w:val="32"/>
+              </w:rPr>
+              <w:t>. -</w:t>
+            </w:r>
+            <w:r>
+              <w:rPr>
+                <w:rFonts w:cs="Arial"/>
+                <w:b/>
+                <w:color w:val="EE0000"/>
+                <w:sz w:val="28"/>
+                <w:szCs w:val="28"/>
+              </w:rPr>
+              <w:t xml:space="preserve"> 2</w:t>
+            </w:r>
+            <w:r>
+              <w:rPr>
+                <w:rFonts w:cs="Arial"/>
+                <w:b/>
+                <w:color w:val="EE0000"/>
+                <w:sz w:val="28"/>
+                <w:szCs w:val="28"/>
+              </w:rPr>
+              <w:t>8</w:t>
+            </w:r>
+          </w:p>
+        </w:tc>
+        <w:tc>
+          <w:tcPr>
+            <w:tcW w:w="5103" w:type="dxa"/>
+          </w:tcPr>
+          <w:p>
+            <w:pPr>
+              <w:widowControl w:val="0"/>
+              <w:autoSpaceDE w:val="0"/>
+              <w:autoSpaceDN w:val="0"/>
+              <w:adjustRightInd w:val="0"/>
+              <w:spacing w:before="0" w:line="240" w:lineRule="auto"/>
+              <w:rPr>
+                <w:rFonts w:ascii="BRH Malayalam Extra" w:eastAsia="Times New Roman" w:hAnsi="BRH Malayalam Extra" w:cs="BRH Malayalam Extra"/>
+                <w:color w:val="EE0000"/>
+                <w:sz w:val="40"/>
+                <w:szCs w:val="40"/>
+                <w:lang w:val="en-IN" w:eastAsia="en-IN" w:bidi="ml-IN"/>
+              </w:rPr>
+            </w:pPr>
+            <w:r>
+              <w:rPr>
+                <w:rFonts w:ascii="BRH Malayalam Extra" w:eastAsia="Times New Roman" w:hAnsi="BRH Malayalam Extra" w:cs="BRH Malayalam Extra"/>
+                <w:color w:val="EE0000"/>
+                <w:sz w:val="40"/>
+                <w:szCs w:val="40"/>
+                <w:lang w:val="en-IN" w:eastAsia="en-IN" w:bidi="ml-IN"/>
+              </w:rPr>
+              <w:t>sªp</w:t>
+            </w:r>
+            <w:r>
+              <w:rPr>
+                <w:rFonts w:ascii="BRH Malayalam Extra" w:eastAsia="Times New Roman" w:hAnsi="BRH Malayalam Extra" w:cs="BRH Malayalam Extra"/>
+                <w:color w:val="EE0000"/>
+                <w:sz w:val="40"/>
+                <w:szCs w:val="40"/>
+                <w:highlight w:val="yellow"/>
+                <w:lang w:val="en-IN" w:eastAsia="en-IN" w:bidi="ml-IN"/>
+              </w:rPr>
+              <w:t>—i</w:t>
+            </w:r>
+            <w:r>
+              <w:rPr>
+                <w:rFonts w:ascii="BRH Malayalam Extra" w:eastAsia="Times New Roman" w:hAnsi="BRH Malayalam Extra" w:cs="BRH Malayalam Extra"/>
+                <w:color w:val="EE0000"/>
+                <w:sz w:val="32"/>
+                <w:szCs w:val="40"/>
+                <w:highlight w:val="yellow"/>
+                <w:lang w:val="en-IN" w:eastAsia="en-IN" w:bidi="ml-IN"/>
+              </w:rPr>
+              <w:t>–</w:t>
+            </w:r>
+            <w:r>
+              <w:rPr>
+                <w:rFonts w:ascii="BRH Malayalam Extra" w:eastAsia="Times New Roman" w:hAnsi="BRH Malayalam Extra" w:cs="BRH Malayalam Extra"/>
+                <w:color w:val="EE0000"/>
+                <w:sz w:val="40"/>
+                <w:szCs w:val="40"/>
+                <w:lang w:val="en-IN" w:eastAsia="en-IN" w:bidi="ml-IN"/>
+              </w:rPr>
+              <w:t>së¡ | A</w:t>
+            </w:r>
+            <w:r>
+              <w:rPr>
+                <w:rFonts w:ascii="BRH Malayalam Extra" w:eastAsia="Times New Roman" w:hAnsi="BRH Malayalam Extra" w:cs="BRH Malayalam Extra"/>
+                <w:color w:val="EE0000"/>
+                <w:sz w:val="32"/>
+                <w:szCs w:val="40"/>
+                <w:lang w:val="en-IN" w:eastAsia="en-IN" w:bidi="ml-IN"/>
+              </w:rPr>
+              <w:t>–</w:t>
+            </w:r>
+            <w:r>
+              <w:rPr>
+                <w:rFonts w:ascii="BRH Malayalam Extra" w:eastAsia="Times New Roman" w:hAnsi="BRH Malayalam Extra" w:cs="BRH Malayalam Extra"/>
+                <w:color w:val="EE0000"/>
+                <w:sz w:val="40"/>
+                <w:szCs w:val="40"/>
+                <w:lang w:val="en-IN" w:eastAsia="en-IN" w:bidi="ml-IN"/>
+              </w:rPr>
+              <w:t>sëûdx—Z¡kI |</w:t>
+            </w:r>
+          </w:p>
+        </w:tc>
+        <w:tc>
+          <w:tcPr>
+            <w:tcW w:w="5386" w:type="dxa"/>
+          </w:tcPr>
+          <w:p>
+            <w:pPr>
+              <w:widowControl w:val="0"/>
+              <w:autoSpaceDE w:val="0"/>
+              <w:autoSpaceDN w:val="0"/>
+              <w:adjustRightInd w:val="0"/>
+              <w:spacing w:before="0" w:line="240" w:lineRule="auto"/>
+              <w:rPr>
+                <w:rFonts w:ascii="BRH Malayalam Extra" w:eastAsia="Times New Roman" w:hAnsi="BRH Malayalam Extra" w:cs="BRH Malayalam Extra"/>
+                <w:color w:val="EE0000"/>
+                <w:sz w:val="40"/>
+                <w:szCs w:val="40"/>
+                <w:lang w:val="en-IN" w:eastAsia="en-IN" w:bidi="ml-IN"/>
+              </w:rPr>
+            </w:pPr>
+            <w:r>
+              <w:rPr>
+                <w:rFonts w:ascii="BRH Malayalam Extra" w:eastAsia="Times New Roman" w:hAnsi="BRH Malayalam Extra" w:cs="BRH Malayalam Extra"/>
+                <w:color w:val="EE0000"/>
+                <w:sz w:val="40"/>
+                <w:szCs w:val="40"/>
+                <w:lang w:val="en-IN" w:eastAsia="en-IN" w:bidi="ml-IN"/>
+              </w:rPr>
+              <w:t>sªp—</w:t>
+            </w:r>
+            <w:r>
+              <w:rPr>
+                <w:rFonts w:ascii="BRH Malayalam Extra" w:eastAsia="Times New Roman" w:hAnsi="BRH Malayalam Extra" w:cs="BRH Malayalam Extra"/>
+                <w:color w:val="EE0000"/>
+                <w:sz w:val="40"/>
+                <w:szCs w:val="40"/>
+                <w:highlight w:val="green"/>
+                <w:lang w:val="en-IN" w:eastAsia="en-IN" w:bidi="ml-IN"/>
+              </w:rPr>
+              <w:t>i</w:t>
+            </w:r>
+            <w:r>
+              <w:rPr>
+                <w:rFonts w:ascii="BRH Malayalam Extra" w:eastAsia="Times New Roman" w:hAnsi="BRH Malayalam Extra" w:cs="BRH Malayalam Extra"/>
+                <w:color w:val="EE0000"/>
+                <w:sz w:val="40"/>
+                <w:szCs w:val="40"/>
+                <w:lang w:val="en-IN" w:eastAsia="en-IN" w:bidi="ml-IN"/>
+              </w:rPr>
+              <w:t>së¡ | A</w:t>
+            </w:r>
+            <w:r>
+              <w:rPr>
+                <w:rFonts w:ascii="BRH Malayalam Extra" w:eastAsia="Times New Roman" w:hAnsi="BRH Malayalam Extra" w:cs="BRH Malayalam Extra"/>
+                <w:color w:val="EE0000"/>
+                <w:sz w:val="32"/>
+                <w:szCs w:val="40"/>
+                <w:lang w:val="en-IN" w:eastAsia="en-IN" w:bidi="ml-IN"/>
+              </w:rPr>
+              <w:t>–</w:t>
+            </w:r>
+            <w:r>
+              <w:rPr>
+                <w:rFonts w:ascii="BRH Malayalam Extra" w:eastAsia="Times New Roman" w:hAnsi="BRH Malayalam Extra" w:cs="BRH Malayalam Extra"/>
+                <w:color w:val="EE0000"/>
+                <w:sz w:val="40"/>
+                <w:szCs w:val="40"/>
+                <w:lang w:val="en-IN" w:eastAsia="en-IN" w:bidi="ml-IN"/>
+              </w:rPr>
+              <w:t>sëûdx—Z¡kI |</w:t>
+            </w:r>
+          </w:p>
+        </w:tc>
+      </w:tr>
+      <w:tr>
+        <w:trPr>
+          <w:trHeight w:val="1104"/>
+        </w:trPr>
+        <w:tc>
+          <w:tcPr>
+            <w:tcW w:w="3974" w:type="dxa"/>
+          </w:tcPr>
+          <w:p>
+            <w:pPr>
+              <w:widowControl w:val="0"/>
+              <w:tabs>
+                <w:tab w:val="left" w:pos="993"/>
+              </w:tabs>
+              <w:autoSpaceDE w:val="0"/>
+              <w:autoSpaceDN w:val="0"/>
+              <w:adjustRightInd w:val="0"/>
+              <w:spacing w:before="0" w:line="240" w:lineRule="auto"/>
+              <w:ind w:right="297"/>
+              <w:rPr>
+                <w:rFonts w:cs="Arial"/>
+                <w:b/>
                 <w:color w:val="000000"/>
                 <w:sz w:val="28"/>
                 <w:szCs w:val="32"/>
@@ -1821,6 +2123,7 @@
                 <w:sz w:val="28"/>
                 <w:szCs w:val="32"/>
               </w:rPr>
+              <w:lastRenderedPageBreak/>
               <w:t>T.S.</w:t>
             </w:r>
             <w:r>
@@ -1831,27 +2134,7 @@
                 <w:sz w:val="28"/>
                 <w:szCs w:val="32"/>
               </w:rPr>
-              <w:t>4.2.</w:t>
-            </w:r>
-            <w:r>
-              <w:rPr>
-                <w:rFonts w:cs="Arial"/>
-                <w:b/>
-                <w:color w:val="000000"/>
-                <w:sz w:val="28"/>
-                <w:szCs w:val="32"/>
-              </w:rPr>
-              <w:t>11</w:t>
-            </w:r>
-            <w:r>
-              <w:rPr>
-                <w:rFonts w:cs="Arial"/>
-                <w:b/>
-                <w:color w:val="000000"/>
-                <w:sz w:val="28"/>
-                <w:szCs w:val="32"/>
-              </w:rPr>
-              <w:t xml:space="preserve">.3 </w:t>
+              <w:t xml:space="preserve">4.2.11.3 </w:t>
             </w:r>
             <w:r>
               <w:rPr>
@@ -1881,30 +2164,19 @@
                 <w:color w:val="000000"/>
                 <w:sz w:val="28"/>
                 <w:szCs w:val="32"/>
-                <w:lang w:val="it-IT"/>
-              </w:rPr>
-            </w:pPr>
-            <w:r>
-              <w:rPr>
-                <w:rFonts w:cs="Arial"/>
-                <w:b/>
-                <w:color w:val="000000"/>
-                <w:sz w:val="28"/>
-                <w:szCs w:val="32"/>
-                <w:lang w:val="it-IT"/>
-              </w:rPr>
-              <w:t xml:space="preserve">Krama Vaakyam No. - </w:t>
-            </w:r>
-            <w:r>
-              <w:rPr>
-                <w:rFonts w:cs="Arial"/>
-                <w:b/>
-                <w:color w:val="000000"/>
-                <w:sz w:val="28"/>
-                <w:szCs w:val="32"/>
-                <w:lang w:val="it-IT"/>
-              </w:rPr>
-              <w:t>66</w:t>
+                <w:lang w:val="en-IN"/>
+              </w:rPr>
+            </w:pPr>
+            <w:r>
+              <w:rPr>
+                <w:rFonts w:cs="Arial"/>
+                <w:b/>
+                <w:color w:val="000000"/>
+                <w:sz w:val="28"/>
+                <w:szCs w:val="32"/>
+                <w:lang w:val="en-IN"/>
+              </w:rPr>
+              <w:t>Krama Vaakyam No. - 66</w:t>
             </w:r>
           </w:p>
           <w:p>
@@ -2329,7 +2601,6 @@
           <w:szCs w:val="32"/>
           <w:u w:val="single"/>
         </w:rPr>
-        <w:lastRenderedPageBreak/>
         <w:t xml:space="preserve">TS </w:t>
       </w:r>
       <w:r>
@@ -3471,6 +3742,7 @@
                 <w:sz w:val="28"/>
                 <w:szCs w:val="32"/>
               </w:rPr>
+              <w:lastRenderedPageBreak/>
               <w:t>T.S.4.2.4.4 – Kramam</w:t>
             </w:r>
           </w:p>
@@ -3917,7 +4189,6 @@
                 <w:sz w:val="28"/>
                 <w:szCs w:val="32"/>
               </w:rPr>
-              <w:lastRenderedPageBreak/>
               <w:t>T.S.4.2.5.1 – Kramam</w:t>
             </w:r>
           </w:p>
@@ -5762,6 +6033,7 @@
                 <w:sz w:val="28"/>
                 <w:szCs w:val="32"/>
               </w:rPr>
+              <w:lastRenderedPageBreak/>
               <w:t>T.S.4.2.5.6 – Kramam</w:t>
             </w:r>
           </w:p>
@@ -6415,7 +6687,6 @@
                 <w:szCs w:val="40"/>
                 <w:lang w:val="en-IN" w:eastAsia="en-IN" w:bidi="ml-IN"/>
               </w:rPr>
-              <w:lastRenderedPageBreak/>
               <w:t>e¡</w:t>
             </w:r>
             <w:r>
@@ -6548,7 +6819,6 @@
                 <w:szCs w:val="40"/>
                 <w:lang w:val="en-IN" w:eastAsia="en-IN" w:bidi="ml-IN"/>
               </w:rPr>
-              <w:lastRenderedPageBreak/>
               <w:t>e¡rðx—pZzJ öe</w:t>
             </w:r>
             <w:r>
@@ -6591,7 +6861,6 @@
                 <w:szCs w:val="40"/>
                 <w:lang w:val="en-IN" w:eastAsia="en-IN" w:bidi="ml-IN"/>
               </w:rPr>
-              <w:lastRenderedPageBreak/>
               <w:t>e¡</w:t>
             </w:r>
             <w:r>
@@ -6731,7 +7000,6 @@
                 <w:sz w:val="28"/>
                 <w:szCs w:val="32"/>
               </w:rPr>
-              <w:lastRenderedPageBreak/>
               <w:t>T.S.4.2.7.3 – Kramam</w:t>
             </w:r>
           </w:p>
@@ -7936,16 +8204,7 @@
           <w:bCs/>
           <w:sz w:val="32"/>
         </w:rPr>
-        <w:t xml:space="preserve">replaced </w:t>
-      </w:r>
-      <w:proofErr w:type="gramStart"/>
-      <w:r>
-        <w:rPr>
-          <w:b/>
-          <w:bCs/>
-          <w:sz w:val="32"/>
-        </w:rPr>
-        <w:t>with</w:t>
+        <w:t>replaced with</w:t>
       </w:r>
       <w:r>
         <w:rPr>
@@ -7967,7 +8226,6 @@
         </w:rPr>
         <w:t>"</w:t>
       </w:r>
-      <w:proofErr w:type="gramEnd"/>
       <w:r>
         <w:rPr>
           <w:rFonts w:ascii="BRH Malayalam" w:hAnsi="BRH Malayalam" w:cs="BRH Malayalam"/>
@@ -7979,7 +8237,6 @@
         </w:rPr>
         <w:t>q§T</w:t>
       </w:r>
-      <w:proofErr w:type="gramStart"/>
       <w:r>
         <w:rPr>
           <w:rFonts w:ascii="BRH Malayalam" w:hAnsi="BRH Malayalam" w:cs="BRH Malayalam"/>
@@ -7996,16 +8253,7 @@
           <w:bCs/>
           <w:sz w:val="32"/>
         </w:rPr>
-        <w:t>wherever</w:t>
-      </w:r>
-      <w:proofErr w:type="gramEnd"/>
-      <w:r>
-        <w:rPr>
-          <w:b/>
-          <w:bCs/>
-          <w:sz w:val="32"/>
-        </w:rPr>
-        <w:t xml:space="preserve"> applicable</w:t>
+        <w:t>wherever applicable</w:t>
       </w:r>
     </w:p>
     <w:p>
@@ -8094,7 +8342,6 @@
           <w:szCs w:val="32"/>
           <w:u w:val="single"/>
         </w:rPr>
-        <w:lastRenderedPageBreak/>
         <w:t xml:space="preserve">TS </w:t>
       </w:r>
       <w:r>
@@ -8449,7 +8696,7 @@
 </file>
 
 <file path=word/endnotes.xml><?xml version="1.0" encoding="utf-8"?>
-<w:endnotes xmlns:wpc="http://schemas.microsoft.com/office/word/2010/wordprocessingCanvas" xmlns:cx="http://schemas.microsoft.com/office/drawing/2014/chartex" xmlns:cx1="http://schemas.microsoft.com/office/drawing/2015/9/8/chartex" xmlns:cx2="http://schemas.microsoft.com/office/drawing/2015/10/21/chartex" xmlns:cx3="http://schemas.microsoft.com/office/drawing/2016/5/9/chartex" xmlns:cx4="http://schemas.microsoft.com/office/drawing/2016/5/10/chartex" xmlns:cx5="http://schemas.microsoft.com/office/drawing/2016/5/11/chartex" xmlns:cx6="http://schemas.microsoft.com/office/drawing/2016/5/12/chartex" xmlns:cx7="http://schemas.microsoft.com/office/drawing/2016/5/13/chartex" xmlns:cx8="http://schemas.microsoft.com/office/drawing/2016/5/14/chartex" xmlns:mc="http://schemas.openxmlformats.org/markup-compatibility/2006" xmlns:aink="http://schemas.microsoft.com/office/drawing/2016/ink" xmlns:am3d="http://schemas.microsoft.com/office/drawing/2017/model3d" xmlns:o="urn:schemas-microsoft-com:office:office" xmlns:oel="http://schemas.microsoft.com/office/2019/extlst" xmlns:r="http://schemas.openxmlformats.org/officeDocument/2006/relationships" xmlns:m="http://schemas.openxmlformats.org/officeDocument/2006/math" xmlns:v="urn:schemas-microsoft-com:vml" xmlns:wp14="http://schemas.microsoft.com/office/word/2010/wordprocessingDrawing" xmlns:wp="http://schemas.openxmlformats.org/drawingml/2006/wordprocessingDrawing" xmlns:w10="urn:schemas-microsoft-com:office:word" xmlns:w="http://schemas.openxmlformats.org/wordprocessingml/2006/main" xmlns:w14="http://schemas.microsoft.com/office/word/2010/wordml" xmlns:w15="http://schemas.microsoft.com/office/word/2012/wordml" xmlns:w16cei="http://schemas.microsoft.com/office/word/2026/wordml/cei" xmlns:w16cex="http://schemas.microsoft.com/office/word/2018/wordml/cex" xmlns:w16cid="http://schemas.microsoft.com/office/word/2016/wordml/cid" xmlns:w16="http://schemas.microsoft.com/office/word/2018/wordml" xmlns:w16du="http://schemas.microsoft.com/office/word/2023/wordml/word16du" xmlns:w16sdtdh="http://schemas.microsoft.com/office/word/2020/wordml/sdtdatahash" xmlns:w16sdtfl="http://schemas.microsoft.com/office/word/2024/wordml/sdtformatlock" xmlns:w16se="http://schemas.microsoft.com/office/word/2015/wordml/symex" xmlns:wpg="http://schemas.microsoft.com/office/word/2010/wordprocessingGroup" xmlns:wpi="http://schemas.microsoft.com/office/word/2010/wordprocessingInk" xmlns:wne="http://schemas.microsoft.com/office/word/2006/wordml" xmlns:wps="http://schemas.microsoft.com/office/word/2010/wordprocessingShape" mc:Ignorable="w14 w15 w16se w16cid w16 w16cex w16sdtdh w16sdtfl w16du wp14">
+<w:endnotes xmlns:wpc="http://schemas.microsoft.com/office/word/2010/wordprocessingCanvas" xmlns:cx="http://schemas.microsoft.com/office/drawing/2014/chartex" xmlns:cx1="http://schemas.microsoft.com/office/drawing/2015/9/8/chartex" xmlns:cx2="http://schemas.microsoft.com/office/drawing/2015/10/21/chartex" xmlns:cx3="http://schemas.microsoft.com/office/drawing/2016/5/9/chartex" xmlns:cx4="http://schemas.microsoft.com/office/drawing/2016/5/10/chartex" xmlns:cx5="http://schemas.microsoft.com/office/drawing/2016/5/11/chartex" xmlns:cx6="http://schemas.microsoft.com/office/drawing/2016/5/12/chartex" xmlns:cx7="http://schemas.microsoft.com/office/drawing/2016/5/13/chartex" xmlns:cx8="http://schemas.microsoft.com/office/drawing/2016/5/14/chartex" xmlns:mc="http://schemas.openxmlformats.org/markup-compatibility/2006" xmlns:aink="http://schemas.microsoft.com/office/drawing/2016/ink" xmlns:am3d="http://schemas.microsoft.com/office/drawing/2017/model3d" xmlns:o="urn:schemas-microsoft-com:office:office" xmlns:oel="http://schemas.microsoft.com/office/2019/extlst" xmlns:r="http://schemas.openxmlformats.org/officeDocument/2006/relationships" xmlns:m="http://schemas.openxmlformats.org/officeDocument/2006/math" xmlns:v="urn:schemas-microsoft-com:vml" xmlns:wp14="http://schemas.microsoft.com/office/word/2010/wordprocessingDrawing" xmlns:wp="http://schemas.openxmlformats.org/drawingml/2006/wordprocessingDrawing" xmlns:w10="urn:schemas-microsoft-com:office:word" xmlns:w="http://schemas.openxmlformats.org/wordprocessingml/2006/main" xmlns:w14="http://schemas.microsoft.com/office/word/2010/wordml" xmlns:w15="http://schemas.microsoft.com/office/word/2012/wordml" xmlns:w16cex="http://schemas.microsoft.com/office/word/2018/wordml/cex" xmlns:w16cid="http://schemas.microsoft.com/office/word/2016/wordml/cid" xmlns:w16="http://schemas.microsoft.com/office/word/2018/wordml" xmlns:w16du="http://schemas.microsoft.com/office/word/2023/wordml/word16du" xmlns:w16sdtdh="http://schemas.microsoft.com/office/word/2020/wordml/sdtdatahash" xmlns:w16sdtfl="http://schemas.microsoft.com/office/word/2024/wordml/sdtformatlock" xmlns:w16se="http://schemas.microsoft.com/office/word/2015/wordml/symex" xmlns:wpg="http://schemas.microsoft.com/office/word/2010/wordprocessingGroup" xmlns:wpi="http://schemas.microsoft.com/office/word/2010/wordprocessingInk" xmlns:wne="http://schemas.microsoft.com/office/word/2006/wordml" xmlns:wps="http://schemas.microsoft.com/office/word/2010/wordprocessingShape" mc:Ignorable="w14 w15 w16se w16cid w16 w16cex w16sdtdh w16sdtfl w16du wp14">
   <w:endnote w:type="separator" w:id="-1">
     <w:p>
       <w:pPr>
@@ -8474,7 +8721,7 @@
 </file>
 
 <file path=word/footer1.xml><?xml version="1.0" encoding="utf-8"?>
-<w:ftr xmlns:wpc="http://schemas.microsoft.com/office/word/2010/wordprocessingCanvas" xmlns:cx="http://schemas.microsoft.com/office/drawing/2014/chartex" xmlns:cx1="http://schemas.microsoft.com/office/drawing/2015/9/8/chartex" xmlns:cx2="http://schemas.microsoft.com/office/drawing/2015/10/21/chartex" xmlns:cx3="http://schemas.microsoft.com/office/drawing/2016/5/9/chartex" xmlns:cx4="http://schemas.microsoft.com/office/drawing/2016/5/10/chartex" xmlns:cx5="http://schemas.microsoft.com/office/drawing/2016/5/11/chartex" xmlns:cx6="http://schemas.microsoft.com/office/drawing/2016/5/12/chartex" xmlns:cx7="http://schemas.microsoft.com/office/drawing/2016/5/13/chartex" xmlns:cx8="http://schemas.microsoft.com/office/drawing/2016/5/14/chartex" xmlns:mc="http://schemas.openxmlformats.org/markup-compatibility/2006" xmlns:aink="http://schemas.microsoft.com/office/drawing/2016/ink" xmlns:am3d="http://schemas.microsoft.com/office/drawing/2017/model3d" xmlns:o="urn:schemas-microsoft-com:office:office" xmlns:oel="http://schemas.microsoft.com/office/2019/extlst" xmlns:r="http://schemas.openxmlformats.org/officeDocument/2006/relationships" xmlns:m="http://schemas.openxmlformats.org/officeDocument/2006/math" xmlns:v="urn:schemas-microsoft-com:vml" xmlns:wp14="http://schemas.microsoft.com/office/word/2010/wordprocessingDrawing" xmlns:wp="http://schemas.openxmlformats.org/drawingml/2006/wordprocessingDrawing" xmlns:w10="urn:schemas-microsoft-com:office:word" xmlns:w="http://schemas.openxmlformats.org/wordprocessingml/2006/main" xmlns:w14="http://schemas.microsoft.com/office/word/2010/wordml" xmlns:w15="http://schemas.microsoft.com/office/word/2012/wordml" xmlns:w16cei="http://schemas.microsoft.com/office/word/2026/wordml/cei" xmlns:w16cex="http://schemas.microsoft.com/office/word/2018/wordml/cex" xmlns:w16cid="http://schemas.microsoft.com/office/word/2016/wordml/cid" xmlns:w16="http://schemas.microsoft.com/office/word/2018/wordml" xmlns:w16du="http://schemas.microsoft.com/office/word/2023/wordml/word16du" xmlns:w16sdtdh="http://schemas.microsoft.com/office/word/2020/wordml/sdtdatahash" xmlns:w16sdtfl="http://schemas.microsoft.com/office/word/2024/wordml/sdtformatlock" xmlns:w16se="http://schemas.microsoft.com/office/word/2015/wordml/symex" xmlns:wpg="http://schemas.microsoft.com/office/word/2010/wordprocessingGroup" xmlns:wpi="http://schemas.microsoft.com/office/word/2010/wordprocessingInk" xmlns:wne="http://schemas.microsoft.com/office/word/2006/wordml" xmlns:wps="http://schemas.microsoft.com/office/word/2010/wordprocessingShape" mc:Ignorable="w14 w15 w16se w16cid w16 w16cex w16sdtdh w16sdtfl w16du wp14">
+<w:ftr xmlns:wpc="http://schemas.microsoft.com/office/word/2010/wordprocessingCanvas" xmlns:cx="http://schemas.microsoft.com/office/drawing/2014/chartex" xmlns:cx1="http://schemas.microsoft.com/office/drawing/2015/9/8/chartex" xmlns:cx2="http://schemas.microsoft.com/office/drawing/2015/10/21/chartex" xmlns:cx3="http://schemas.microsoft.com/office/drawing/2016/5/9/chartex" xmlns:cx4="http://schemas.microsoft.com/office/drawing/2016/5/10/chartex" xmlns:cx5="http://schemas.microsoft.com/office/drawing/2016/5/11/chartex" xmlns:cx6="http://schemas.microsoft.com/office/drawing/2016/5/12/chartex" xmlns:cx7="http://schemas.microsoft.com/office/drawing/2016/5/13/chartex" xmlns:cx8="http://schemas.microsoft.com/office/drawing/2016/5/14/chartex" xmlns:mc="http://schemas.openxmlformats.org/markup-compatibility/2006" xmlns:aink="http://schemas.microsoft.com/office/drawing/2016/ink" xmlns:am3d="http://schemas.microsoft.com/office/drawing/2017/model3d" xmlns:o="urn:schemas-microsoft-com:office:office" xmlns:oel="http://schemas.microsoft.com/office/2019/extlst" xmlns:r="http://schemas.openxmlformats.org/officeDocument/2006/relationships" xmlns:m="http://schemas.openxmlformats.org/officeDocument/2006/math" xmlns:v="urn:schemas-microsoft-com:vml" xmlns:wp14="http://schemas.microsoft.com/office/word/2010/wordprocessingDrawing" xmlns:wp="http://schemas.openxmlformats.org/drawingml/2006/wordprocessingDrawing" xmlns:w10="urn:schemas-microsoft-com:office:word" xmlns:w="http://schemas.openxmlformats.org/wordprocessingml/2006/main" xmlns:w14="http://schemas.microsoft.com/office/word/2010/wordml" xmlns:w15="http://schemas.microsoft.com/office/word/2012/wordml" xmlns:w16cex="http://schemas.microsoft.com/office/word/2018/wordml/cex" xmlns:w16cid="http://schemas.microsoft.com/office/word/2016/wordml/cid" xmlns:w16="http://schemas.microsoft.com/office/word/2018/wordml" xmlns:w16du="http://schemas.microsoft.com/office/word/2023/wordml/word16du" xmlns:w16sdtdh="http://schemas.microsoft.com/office/word/2020/wordml/sdtdatahash" xmlns:w16sdtfl="http://schemas.microsoft.com/office/word/2024/wordml/sdtformatlock" xmlns:w16se="http://schemas.microsoft.com/office/word/2015/wordml/symex" xmlns:wpg="http://schemas.microsoft.com/office/word/2010/wordprocessingGroup" xmlns:wpi="http://schemas.microsoft.com/office/word/2010/wordprocessingInk" xmlns:wne="http://schemas.microsoft.com/office/word/2006/wordml" xmlns:wps="http://schemas.microsoft.com/office/word/2010/wordprocessingShape" mc:Ignorable="w14 w15 w16se w16cid w16 w16cex w16sdtdh w16sdtfl w16du wp14">
   <w:p>
     <w:pPr>
       <w:pBdr>
@@ -8656,7 +8903,7 @@
 </file>
 
 <file path=word/footer2.xml><?xml version="1.0" encoding="utf-8"?>
-<w:ftr xmlns:wpc="http://schemas.microsoft.com/office/word/2010/wordprocessingCanvas" xmlns:cx="http://schemas.microsoft.com/office/drawing/2014/chartex" xmlns:cx1="http://schemas.microsoft.com/office/drawing/2015/9/8/chartex" xmlns:cx2="http://schemas.microsoft.com/office/drawing/2015/10/21/chartex" xmlns:cx3="http://schemas.microsoft.com/office/drawing/2016/5/9/chartex" xmlns:cx4="http://schemas.microsoft.com/office/drawing/2016/5/10/chartex" xmlns:cx5="http://schemas.microsoft.com/office/drawing/2016/5/11/chartex" xmlns:cx6="http://schemas.microsoft.com/office/drawing/2016/5/12/chartex" xmlns:cx7="http://schemas.microsoft.com/office/drawing/2016/5/13/chartex" xmlns:cx8="http://schemas.microsoft.com/office/drawing/2016/5/14/chartex" xmlns:mc="http://schemas.openxmlformats.org/markup-compatibility/2006" xmlns:aink="http://schemas.microsoft.com/office/drawing/2016/ink" xmlns:am3d="http://schemas.microsoft.com/office/drawing/2017/model3d" xmlns:o="urn:schemas-microsoft-com:office:office" xmlns:oel="http://schemas.microsoft.com/office/2019/extlst" xmlns:r="http://schemas.openxmlformats.org/officeDocument/2006/relationships" xmlns:m="http://schemas.openxmlformats.org/officeDocument/2006/math" xmlns:v="urn:schemas-microsoft-com:vml" xmlns:wp14="http://schemas.microsoft.com/office/word/2010/wordprocessingDrawing" xmlns:wp="http://schemas.openxmlformats.org/drawingml/2006/wordprocessingDrawing" xmlns:w10="urn:schemas-microsoft-com:office:word" xmlns:w="http://schemas.openxmlformats.org/wordprocessingml/2006/main" xmlns:w14="http://schemas.microsoft.com/office/word/2010/wordml" xmlns:w15="http://schemas.microsoft.com/office/word/2012/wordml" xmlns:w16cei="http://schemas.microsoft.com/office/word/2026/wordml/cei" xmlns:w16cex="http://schemas.microsoft.com/office/word/2018/wordml/cex" xmlns:w16cid="http://schemas.microsoft.com/office/word/2016/wordml/cid" xmlns:w16="http://schemas.microsoft.com/office/word/2018/wordml" xmlns:w16du="http://schemas.microsoft.com/office/word/2023/wordml/word16du" xmlns:w16sdtdh="http://schemas.microsoft.com/office/word/2020/wordml/sdtdatahash" xmlns:w16sdtfl="http://schemas.microsoft.com/office/word/2024/wordml/sdtformatlock" xmlns:w16se="http://schemas.microsoft.com/office/word/2015/wordml/symex" xmlns:wpg="http://schemas.microsoft.com/office/word/2010/wordprocessingGroup" xmlns:wpi="http://schemas.microsoft.com/office/word/2010/wordprocessingInk" xmlns:wne="http://schemas.microsoft.com/office/word/2006/wordml" xmlns:wps="http://schemas.microsoft.com/office/word/2010/wordprocessingShape" mc:Ignorable="w14 w15 w16se w16cid w16 w16cex w16sdtdh w16sdtfl w16du wp14">
+<w:ftr xmlns:wpc="http://schemas.microsoft.com/office/word/2010/wordprocessingCanvas" xmlns:cx="http://schemas.microsoft.com/office/drawing/2014/chartex" xmlns:cx1="http://schemas.microsoft.com/office/drawing/2015/9/8/chartex" xmlns:cx2="http://schemas.microsoft.com/office/drawing/2015/10/21/chartex" xmlns:cx3="http://schemas.microsoft.com/office/drawing/2016/5/9/chartex" xmlns:cx4="http://schemas.microsoft.com/office/drawing/2016/5/10/chartex" xmlns:cx5="http://schemas.microsoft.com/office/drawing/2016/5/11/chartex" xmlns:cx6="http://schemas.microsoft.com/office/drawing/2016/5/12/chartex" xmlns:cx7="http://schemas.microsoft.com/office/drawing/2016/5/13/chartex" xmlns:cx8="http://schemas.microsoft.com/office/drawing/2016/5/14/chartex" xmlns:mc="http://schemas.openxmlformats.org/markup-compatibility/2006" xmlns:aink="http://schemas.microsoft.com/office/drawing/2016/ink" xmlns:am3d="http://schemas.microsoft.com/office/drawing/2017/model3d" xmlns:o="urn:schemas-microsoft-com:office:office" xmlns:oel="http://schemas.microsoft.com/office/2019/extlst" xmlns:r="http://schemas.openxmlformats.org/officeDocument/2006/relationships" xmlns:m="http://schemas.openxmlformats.org/officeDocument/2006/math" xmlns:v="urn:schemas-microsoft-com:vml" xmlns:wp14="http://schemas.microsoft.com/office/word/2010/wordprocessingDrawing" xmlns:wp="http://schemas.openxmlformats.org/drawingml/2006/wordprocessingDrawing" xmlns:w10="urn:schemas-microsoft-com:office:word" xmlns:w="http://schemas.openxmlformats.org/wordprocessingml/2006/main" xmlns:w14="http://schemas.microsoft.com/office/word/2010/wordml" xmlns:w15="http://schemas.microsoft.com/office/word/2012/wordml" xmlns:w16cex="http://schemas.microsoft.com/office/word/2018/wordml/cex" xmlns:w16cid="http://schemas.microsoft.com/office/word/2016/wordml/cid" xmlns:w16="http://schemas.microsoft.com/office/word/2018/wordml" xmlns:w16du="http://schemas.microsoft.com/office/word/2023/wordml/word16du" xmlns:w16sdtdh="http://schemas.microsoft.com/office/word/2020/wordml/sdtdatahash" xmlns:w16sdtfl="http://schemas.microsoft.com/office/word/2024/wordml/sdtformatlock" xmlns:w16se="http://schemas.microsoft.com/office/word/2015/wordml/symex" xmlns:wpg="http://schemas.microsoft.com/office/word/2010/wordprocessingGroup" xmlns:wpi="http://schemas.microsoft.com/office/word/2010/wordprocessingInk" xmlns:wne="http://schemas.microsoft.com/office/word/2006/wordml" xmlns:wps="http://schemas.microsoft.com/office/word/2010/wordprocessingShape" mc:Ignorable="w14 w15 w16se w16cid w16 w16cex w16sdtdh w16sdtfl w16du wp14">
   <w:p>
     <w:pPr>
       <w:pBdr>
@@ -8846,7 +9093,7 @@
 </file>
 
 <file path=word/footnotes.xml><?xml version="1.0" encoding="utf-8"?>
-<w:footnotes xmlns:wpc="http://schemas.microsoft.com/office/word/2010/wordprocessingCanvas" xmlns:cx="http://schemas.microsoft.com/office/drawing/2014/chartex" xmlns:cx1="http://schemas.microsoft.com/office/drawing/2015/9/8/chartex" xmlns:cx2="http://schemas.microsoft.com/office/drawing/2015/10/21/chartex" xmlns:cx3="http://schemas.microsoft.com/office/drawing/2016/5/9/chartex" xmlns:cx4="http://schemas.microsoft.com/office/drawing/2016/5/10/chartex" xmlns:cx5="http://schemas.microsoft.com/office/drawing/2016/5/11/chartex" xmlns:cx6="http://schemas.microsoft.com/office/drawing/2016/5/12/chartex" xmlns:cx7="http://schemas.microsoft.com/office/drawing/2016/5/13/chartex" xmlns:cx8="http://schemas.microsoft.com/office/drawing/2016/5/14/chartex" xmlns:mc="http://schemas.openxmlformats.org/markup-compatibility/2006" xmlns:aink="http://schemas.microsoft.com/office/drawing/2016/ink" xmlns:am3d="http://schemas.microsoft.com/office/drawing/2017/model3d" xmlns:o="urn:schemas-microsoft-com:office:office" xmlns:oel="http://schemas.microsoft.com/office/2019/extlst" xmlns:r="http://schemas.openxmlformats.org/officeDocument/2006/relationships" xmlns:m="http://schemas.openxmlformats.org/officeDocument/2006/math" xmlns:v="urn:schemas-microsoft-com:vml" xmlns:wp14="http://schemas.microsoft.com/office/word/2010/wordprocessingDrawing" xmlns:wp="http://schemas.openxmlformats.org/drawingml/2006/wordprocessingDrawing" xmlns:w10="urn:schemas-microsoft-com:office:word" xmlns:w="http://schemas.openxmlformats.org/wordprocessingml/2006/main" xmlns:w14="http://schemas.microsoft.com/office/word/2010/wordml" xmlns:w15="http://schemas.microsoft.com/office/word/2012/wordml" xmlns:w16cei="http://schemas.microsoft.com/office/word/2026/wordml/cei" xmlns:w16cex="http://schemas.microsoft.com/office/word/2018/wordml/cex" xmlns:w16cid="http://schemas.microsoft.com/office/word/2016/wordml/cid" xmlns:w16="http://schemas.microsoft.com/office/word/2018/wordml" xmlns:w16du="http://schemas.microsoft.com/office/word/2023/wordml/word16du" xmlns:w16sdtdh="http://schemas.microsoft.com/office/word/2020/wordml/sdtdatahash" xmlns:w16sdtfl="http://schemas.microsoft.com/office/word/2024/wordml/sdtformatlock" xmlns:w16se="http://schemas.microsoft.com/office/word/2015/wordml/symex" xmlns:wpg="http://schemas.microsoft.com/office/word/2010/wordprocessingGroup" xmlns:wpi="http://schemas.microsoft.com/office/word/2010/wordprocessingInk" xmlns:wne="http://schemas.microsoft.com/office/word/2006/wordml" xmlns:wps="http://schemas.microsoft.com/office/word/2010/wordprocessingShape" mc:Ignorable="w14 w15 w16se w16cid w16 w16cex w16sdtdh w16sdtfl w16du wp14">
+<w:footnotes xmlns:wpc="http://schemas.microsoft.com/office/word/2010/wordprocessingCanvas" xmlns:cx="http://schemas.microsoft.com/office/drawing/2014/chartex" xmlns:cx1="http://schemas.microsoft.com/office/drawing/2015/9/8/chartex" xmlns:cx2="http://schemas.microsoft.com/office/drawing/2015/10/21/chartex" xmlns:cx3="http://schemas.microsoft.com/office/drawing/2016/5/9/chartex" xmlns:cx4="http://schemas.microsoft.com/office/drawing/2016/5/10/chartex" xmlns:cx5="http://schemas.microsoft.com/office/drawing/2016/5/11/chartex" xmlns:cx6="http://schemas.microsoft.com/office/drawing/2016/5/12/chartex" xmlns:cx7="http://schemas.microsoft.com/office/drawing/2016/5/13/chartex" xmlns:cx8="http://schemas.microsoft.com/office/drawing/2016/5/14/chartex" xmlns:mc="http://schemas.openxmlformats.org/markup-compatibility/2006" xmlns:aink="http://schemas.microsoft.com/office/drawing/2016/ink" xmlns:am3d="http://schemas.microsoft.com/office/drawing/2017/model3d" xmlns:o="urn:schemas-microsoft-com:office:office" xmlns:oel="http://schemas.microsoft.com/office/2019/extlst" xmlns:r="http://schemas.openxmlformats.org/officeDocument/2006/relationships" xmlns:m="http://schemas.openxmlformats.org/officeDocument/2006/math" xmlns:v="urn:schemas-microsoft-com:vml" xmlns:wp14="http://schemas.microsoft.com/office/word/2010/wordprocessingDrawing" xmlns:wp="http://schemas.openxmlformats.org/drawingml/2006/wordprocessingDrawing" xmlns:w10="urn:schemas-microsoft-com:office:word" xmlns:w="http://schemas.openxmlformats.org/wordprocessingml/2006/main" xmlns:w14="http://schemas.microsoft.com/office/word/2010/wordml" xmlns:w15="http://schemas.microsoft.com/office/word/2012/wordml" xmlns:w16cex="http://schemas.microsoft.com/office/word/2018/wordml/cex" xmlns:w16cid="http://schemas.microsoft.com/office/word/2016/wordml/cid" xmlns:w16="http://schemas.microsoft.com/office/word/2018/wordml" xmlns:w16du="http://schemas.microsoft.com/office/word/2023/wordml/word16du" xmlns:w16sdtdh="http://schemas.microsoft.com/office/word/2020/wordml/sdtdatahash" xmlns:w16sdtfl="http://schemas.microsoft.com/office/word/2024/wordml/sdtformatlock" xmlns:w16se="http://schemas.microsoft.com/office/word/2015/wordml/symex" xmlns:wpg="http://schemas.microsoft.com/office/word/2010/wordprocessingGroup" xmlns:wpi="http://schemas.microsoft.com/office/word/2010/wordprocessingInk" xmlns:wne="http://schemas.microsoft.com/office/word/2006/wordml" xmlns:wps="http://schemas.microsoft.com/office/word/2010/wordprocessingShape" mc:Ignorable="w14 w15 w16se w16cid w16 w16cex w16sdtdh w16sdtfl w16du wp14">
   <w:footnote w:type="separator" w:id="-1">
     <w:p>
       <w:pPr>
@@ -8871,7 +9118,7 @@
 </file>
 
 <file path=word/header1.xml><?xml version="1.0" encoding="utf-8"?>
-<w:hdr xmlns:wpc="http://schemas.microsoft.com/office/word/2010/wordprocessingCanvas" xmlns:cx="http://schemas.microsoft.com/office/drawing/2014/chartex" xmlns:cx1="http://schemas.microsoft.com/office/drawing/2015/9/8/chartex" xmlns:cx2="http://schemas.microsoft.com/office/drawing/2015/10/21/chartex" xmlns:cx3="http://schemas.microsoft.com/office/drawing/2016/5/9/chartex" xmlns:cx4="http://schemas.microsoft.com/office/drawing/2016/5/10/chartex" xmlns:cx5="http://schemas.microsoft.com/office/drawing/2016/5/11/chartex" xmlns:cx6="http://schemas.microsoft.com/office/drawing/2016/5/12/chartex" xmlns:cx7="http://schemas.microsoft.com/office/drawing/2016/5/13/chartex" xmlns:cx8="http://schemas.microsoft.com/office/drawing/2016/5/14/chartex" xmlns:mc="http://schemas.openxmlformats.org/markup-compatibility/2006" xmlns:aink="http://schemas.microsoft.com/office/drawing/2016/ink" xmlns:am3d="http://schemas.microsoft.com/office/drawing/2017/model3d" xmlns:o="urn:schemas-microsoft-com:office:office" xmlns:oel="http://schemas.microsoft.com/office/2019/extlst" xmlns:r="http://schemas.openxmlformats.org/officeDocument/2006/relationships" xmlns:m="http://schemas.openxmlformats.org/officeDocument/2006/math" xmlns:v="urn:schemas-microsoft-com:vml" xmlns:wp14="http://schemas.microsoft.com/office/word/2010/wordprocessingDrawing" xmlns:wp="http://schemas.openxmlformats.org/drawingml/2006/wordprocessingDrawing" xmlns:w10="urn:schemas-microsoft-com:office:word" xmlns:w="http://schemas.openxmlformats.org/wordprocessingml/2006/main" xmlns:w14="http://schemas.microsoft.com/office/word/2010/wordml" xmlns:w15="http://schemas.microsoft.com/office/word/2012/wordml" xmlns:w16cei="http://schemas.microsoft.com/office/word/2026/wordml/cei" xmlns:w16cex="http://schemas.microsoft.com/office/word/2018/wordml/cex" xmlns:w16cid="http://schemas.microsoft.com/office/word/2016/wordml/cid" xmlns:w16="http://schemas.microsoft.com/office/word/2018/wordml" xmlns:w16du="http://schemas.microsoft.com/office/word/2023/wordml/word16du" xmlns:w16sdtdh="http://schemas.microsoft.com/office/word/2020/wordml/sdtdatahash" xmlns:w16sdtfl="http://schemas.microsoft.com/office/word/2024/wordml/sdtformatlock" xmlns:w16se="http://schemas.microsoft.com/office/word/2015/wordml/symex" xmlns:wpg="http://schemas.microsoft.com/office/word/2010/wordprocessingGroup" xmlns:wpi="http://schemas.microsoft.com/office/word/2010/wordprocessingInk" xmlns:wne="http://schemas.microsoft.com/office/word/2006/wordml" xmlns:wps="http://schemas.microsoft.com/office/word/2010/wordprocessingShape" mc:Ignorable="w14 w15 w16se w16cid w16 w16cex w16sdtdh w16sdtfl w16du wp14">
+<w:hdr xmlns:wpc="http://schemas.microsoft.com/office/word/2010/wordprocessingCanvas" xmlns:cx="http://schemas.microsoft.com/office/drawing/2014/chartex" xmlns:cx1="http://schemas.microsoft.com/office/drawing/2015/9/8/chartex" xmlns:cx2="http://schemas.microsoft.com/office/drawing/2015/10/21/chartex" xmlns:cx3="http://schemas.microsoft.com/office/drawing/2016/5/9/chartex" xmlns:cx4="http://schemas.microsoft.com/office/drawing/2016/5/10/chartex" xmlns:cx5="http://schemas.microsoft.com/office/drawing/2016/5/11/chartex" xmlns:cx6="http://schemas.microsoft.com/office/drawing/2016/5/12/chartex" xmlns:cx7="http://schemas.microsoft.com/office/drawing/2016/5/13/chartex" xmlns:cx8="http://schemas.microsoft.com/office/drawing/2016/5/14/chartex" xmlns:mc="http://schemas.openxmlformats.org/markup-compatibility/2006" xmlns:aink="http://schemas.microsoft.com/office/drawing/2016/ink" xmlns:am3d="http://schemas.microsoft.com/office/drawing/2017/model3d" xmlns:o="urn:schemas-microsoft-com:office:office" xmlns:oel="http://schemas.microsoft.com/office/2019/extlst" xmlns:r="http://schemas.openxmlformats.org/officeDocument/2006/relationships" xmlns:m="http://schemas.openxmlformats.org/officeDocument/2006/math" xmlns:v="urn:schemas-microsoft-com:vml" xmlns:wp14="http://schemas.microsoft.com/office/word/2010/wordprocessingDrawing" xmlns:wp="http://schemas.openxmlformats.org/drawingml/2006/wordprocessingDrawing" xmlns:w10="urn:schemas-microsoft-com:office:word" xmlns:w="http://schemas.openxmlformats.org/wordprocessingml/2006/main" xmlns:w14="http://schemas.microsoft.com/office/word/2010/wordml" xmlns:w15="http://schemas.microsoft.com/office/word/2012/wordml" xmlns:w16cex="http://schemas.microsoft.com/office/word/2018/wordml/cex" xmlns:w16cid="http://schemas.microsoft.com/office/word/2016/wordml/cid" xmlns:w16="http://schemas.microsoft.com/office/word/2018/wordml" xmlns:w16du="http://schemas.microsoft.com/office/word/2023/wordml/word16du" xmlns:w16sdtdh="http://schemas.microsoft.com/office/word/2020/wordml/sdtdatahash" xmlns:w16sdtfl="http://schemas.microsoft.com/office/word/2024/wordml/sdtformatlock" xmlns:w16se="http://schemas.microsoft.com/office/word/2015/wordml/symex" xmlns:wpg="http://schemas.microsoft.com/office/word/2010/wordprocessingGroup" xmlns:wpi="http://schemas.microsoft.com/office/word/2010/wordprocessingInk" xmlns:wne="http://schemas.microsoft.com/office/word/2006/wordml" xmlns:wps="http://schemas.microsoft.com/office/word/2010/wordprocessingShape" mc:Ignorable="w14 w15 w16se w16cid w16 w16cex w16sdtdh w16sdtfl w16du wp14">
   <w:p>
     <w:pPr>
       <w:pStyle w:val="Header"/>
@@ -8884,7 +9131,7 @@
 </file>
 
 <file path=word/header2.xml><?xml version="1.0" encoding="utf-8"?>
-<w:hdr xmlns:wpc="http://schemas.microsoft.com/office/word/2010/wordprocessingCanvas" xmlns:cx="http://schemas.microsoft.com/office/drawing/2014/chartex" xmlns:cx1="http://schemas.microsoft.com/office/drawing/2015/9/8/chartex" xmlns:cx2="http://schemas.microsoft.com/office/drawing/2015/10/21/chartex" xmlns:cx3="http://schemas.microsoft.com/office/drawing/2016/5/9/chartex" xmlns:cx4="http://schemas.microsoft.com/office/drawing/2016/5/10/chartex" xmlns:cx5="http://schemas.microsoft.com/office/drawing/2016/5/11/chartex" xmlns:cx6="http://schemas.microsoft.com/office/drawing/2016/5/12/chartex" xmlns:cx7="http://schemas.microsoft.com/office/drawing/2016/5/13/chartex" xmlns:cx8="http://schemas.microsoft.com/office/drawing/2016/5/14/chartex" xmlns:mc="http://schemas.openxmlformats.org/markup-compatibility/2006" xmlns:aink="http://schemas.microsoft.com/office/drawing/2016/ink" xmlns:am3d="http://schemas.microsoft.com/office/drawing/2017/model3d" xmlns:o="urn:schemas-microsoft-com:office:office" xmlns:oel="http://schemas.microsoft.com/office/2019/extlst" xmlns:r="http://schemas.openxmlformats.org/officeDocument/2006/relationships" xmlns:m="http://schemas.openxmlformats.org/officeDocument/2006/math" xmlns:v="urn:schemas-microsoft-com:vml" xmlns:wp14="http://schemas.microsoft.com/office/word/2010/wordprocessingDrawing" xmlns:wp="http://schemas.openxmlformats.org/drawingml/2006/wordprocessingDrawing" xmlns:w10="urn:schemas-microsoft-com:office:word" xmlns:w="http://schemas.openxmlformats.org/wordprocessingml/2006/main" xmlns:w14="http://schemas.microsoft.com/office/word/2010/wordml" xmlns:w15="http://schemas.microsoft.com/office/word/2012/wordml" xmlns:w16cei="http://schemas.microsoft.com/office/word/2026/wordml/cei" xmlns:w16cex="http://schemas.microsoft.com/office/word/2018/wordml/cex" xmlns:w16cid="http://schemas.microsoft.com/office/word/2016/wordml/cid" xmlns:w16="http://schemas.microsoft.com/office/word/2018/wordml" xmlns:w16du="http://schemas.microsoft.com/office/word/2023/wordml/word16du" xmlns:w16sdtdh="http://schemas.microsoft.com/office/word/2020/wordml/sdtdatahash" xmlns:w16sdtfl="http://schemas.microsoft.com/office/word/2024/wordml/sdtformatlock" xmlns:w16se="http://schemas.microsoft.com/office/word/2015/wordml/symex" xmlns:wpg="http://schemas.microsoft.com/office/word/2010/wordprocessingGroup" xmlns:wpi="http://schemas.microsoft.com/office/word/2010/wordprocessingInk" xmlns:wne="http://schemas.microsoft.com/office/word/2006/wordml" xmlns:wps="http://schemas.microsoft.com/office/word/2010/wordprocessingShape" mc:Ignorable="w14 w15 w16se w16cid w16 w16cex w16sdtdh w16sdtfl w16du wp14">
+<w:hdr xmlns:wpc="http://schemas.microsoft.com/office/word/2010/wordprocessingCanvas" xmlns:cx="http://schemas.microsoft.com/office/drawing/2014/chartex" xmlns:cx1="http://schemas.microsoft.com/office/drawing/2015/9/8/chartex" xmlns:cx2="http://schemas.microsoft.com/office/drawing/2015/10/21/chartex" xmlns:cx3="http://schemas.microsoft.com/office/drawing/2016/5/9/chartex" xmlns:cx4="http://schemas.microsoft.com/office/drawing/2016/5/10/chartex" xmlns:cx5="http://schemas.microsoft.com/office/drawing/2016/5/11/chartex" xmlns:cx6="http://schemas.microsoft.com/office/drawing/2016/5/12/chartex" xmlns:cx7="http://schemas.microsoft.com/office/drawing/2016/5/13/chartex" xmlns:cx8="http://schemas.microsoft.com/office/drawing/2016/5/14/chartex" xmlns:mc="http://schemas.openxmlformats.org/markup-compatibility/2006" xmlns:aink="http://schemas.microsoft.com/office/drawing/2016/ink" xmlns:am3d="http://schemas.microsoft.com/office/drawing/2017/model3d" xmlns:o="urn:schemas-microsoft-com:office:office" xmlns:oel="http://schemas.microsoft.com/office/2019/extlst" xmlns:r="http://schemas.openxmlformats.org/officeDocument/2006/relationships" xmlns:m="http://schemas.openxmlformats.org/officeDocument/2006/math" xmlns:v="urn:schemas-microsoft-com:vml" xmlns:wp14="http://schemas.microsoft.com/office/word/2010/wordprocessingDrawing" xmlns:wp="http://schemas.openxmlformats.org/drawingml/2006/wordprocessingDrawing" xmlns:w10="urn:schemas-microsoft-com:office:word" xmlns:w="http://schemas.openxmlformats.org/wordprocessingml/2006/main" xmlns:w14="http://schemas.microsoft.com/office/word/2010/wordml" xmlns:w15="http://schemas.microsoft.com/office/word/2012/wordml" xmlns:w16cex="http://schemas.microsoft.com/office/word/2018/wordml/cex" xmlns:w16cid="http://schemas.microsoft.com/office/word/2016/wordml/cid" xmlns:w16="http://schemas.microsoft.com/office/word/2018/wordml" xmlns:w16du="http://schemas.microsoft.com/office/word/2023/wordml/word16du" xmlns:w16sdtdh="http://schemas.microsoft.com/office/word/2020/wordml/sdtdatahash" xmlns:w16sdtfl="http://schemas.microsoft.com/office/word/2024/wordml/sdtformatlock" xmlns:w16se="http://schemas.microsoft.com/office/word/2015/wordml/symex" xmlns:wpg="http://schemas.microsoft.com/office/word/2010/wordprocessingGroup" xmlns:wpi="http://schemas.microsoft.com/office/word/2010/wordprocessingInk" xmlns:wne="http://schemas.microsoft.com/office/word/2006/wordml" xmlns:wps="http://schemas.microsoft.com/office/word/2010/wordprocessingShape" mc:Ignorable="w14 w15 w16se w16cid w16 w16cex w16sdtdh w16sdtfl w16du wp14">
   <w:p>
     <w:pPr>
       <w:pStyle w:val="Header"/>

</xml_diff>